<commit_message>
fix(docs): preserve exact image aspect ratio and dynamic scaling in docx guide
- Read native PNG dimensions directly from image buffer
- Dynamically scale image width and height to preserve true aspect ratio (prevent vertical squishing on tall screenshots like step 2 table)
- Add keepWithNext to headings and images to prevent awkward page splits
</commit_message>
<xml_diff>
--- a/docs/user-guide/HUONG_DAN_SU_DUNG_LUAN_CHUYEN_VA_NHAP_KHO_LIEN_HUB.docx
+++ b/docs/user-guide/HUONG_DAN_SU_DUNG_LUAN_CHUYEN_VA_NHAP_KHO_LIEN_HUB.docx
@@ -195,7 +195,7 @@
       <w:r>
         <w:drawing>
           <wp:inline distT="0" distB="0" distL="0" distR="0">
-            <wp:extent cx="5524500" cy="3105150"/>
+            <wp:extent cx="5124450" cy="4572000"/>
             <wp:effectExtent t="0" r="0" b="0" l="0"/>
             <wp:docPr id="1" name="" descr="" title=""/>
             <wp:cNvGraphicFramePr>
@@ -220,7 +220,7 @@
                   <pic:spPr bwMode="auto">
                     <a:xfrm>
                       <a:off x="0" y="0"/>
-                      <a:ext cx="5524500" cy="3105150"/>
+                      <a:ext cx="5124450" cy="4572000"/>
                     </a:xfrm>
                     <a:prstGeom prst="rect">
                       <a:avLst/>
@@ -422,7 +422,7 @@
       <w:r>
         <w:drawing>
           <wp:inline distT="0" distB="0" distL="0" distR="0">
-            <wp:extent cx="5524500" cy="3105150"/>
+            <wp:extent cx="5429250" cy="3781425"/>
             <wp:effectExtent t="0" r="0" b="0" l="0"/>
             <wp:docPr id="1" name="" descr="" title=""/>
             <wp:cNvGraphicFramePr>
@@ -447,7 +447,7 @@
                   <pic:spPr bwMode="auto">
                     <a:xfrm>
                       <a:off x="0" y="0"/>
-                      <a:ext cx="5524500" cy="3105150"/>
+                      <a:ext cx="5429250" cy="3781425"/>
                     </a:xfrm>
                     <a:prstGeom prst="rect">
                       <a:avLst/>
@@ -628,7 +628,7 @@
       <w:r>
         <w:drawing>
           <wp:inline distT="0" distB="0" distL="0" distR="0">
-            <wp:extent cx="5524500" cy="3105150"/>
+            <wp:extent cx="3733800" cy="4572000"/>
             <wp:effectExtent t="0" r="0" b="0" l="0"/>
             <wp:docPr id="1" name="" descr="" title=""/>
             <wp:cNvGraphicFramePr>
@@ -653,7 +653,7 @@
                   <pic:spPr bwMode="auto">
                     <a:xfrm>
                       <a:off x="0" y="0"/>
-                      <a:ext cx="5524500" cy="3105150"/>
+                      <a:ext cx="3733800" cy="4572000"/>
                     </a:xfrm>
                     <a:prstGeom prst="rect">
                       <a:avLst/>
@@ -758,7 +758,7 @@
       <w:r>
         <w:drawing>
           <wp:inline distT="0" distB="0" distL="0" distR="0">
-            <wp:extent cx="5524500" cy="3105150"/>
+            <wp:extent cx="5172075" cy="4572000"/>
             <wp:effectExtent t="0" r="0" b="0" l="0"/>
             <wp:docPr id="1" name="" descr="" title=""/>
             <wp:cNvGraphicFramePr>
@@ -783,7 +783,7 @@
                   <pic:spPr bwMode="auto">
                     <a:xfrm>
                       <a:off x="0" y="0"/>
-                      <a:ext cx="5524500" cy="3105150"/>
+                      <a:ext cx="5172075" cy="4572000"/>
                     </a:xfrm>
                     <a:prstGeom prst="rect">
                       <a:avLst/>
@@ -888,7 +888,7 @@
       <w:r>
         <w:drawing>
           <wp:inline distT="0" distB="0" distL="0" distR="0">
-            <wp:extent cx="5524500" cy="3105150"/>
+            <wp:extent cx="5124450" cy="4572000"/>
             <wp:effectExtent t="0" r="0" b="0" l="0"/>
             <wp:docPr id="1" name="" descr="" title=""/>
             <wp:cNvGraphicFramePr>
@@ -913,7 +913,7 @@
                   <pic:spPr bwMode="auto">
                     <a:xfrm>
                       <a:off x="0" y="0"/>
-                      <a:ext cx="5524500" cy="3105150"/>
+                      <a:ext cx="5124450" cy="4572000"/>
                     </a:xfrm>
                     <a:prstGeom prst="rect">
                       <a:avLst/>
@@ -1058,7 +1058,7 @@
       <w:r>
         <w:drawing>
           <wp:inline distT="0" distB="0" distL="0" distR="0">
-            <wp:extent cx="5524500" cy="3105150"/>
+            <wp:extent cx="5429250" cy="3390900"/>
             <wp:effectExtent t="0" r="0" b="0" l="0"/>
             <wp:docPr id="1" name="" descr="" title=""/>
             <wp:cNvGraphicFramePr>
@@ -1083,7 +1083,7 @@
                   <pic:spPr bwMode="auto">
                     <a:xfrm>
                       <a:off x="0" y="0"/>
-                      <a:ext cx="5524500" cy="3105150"/>
+                      <a:ext cx="5429250" cy="3390900"/>
                     </a:xfrm>
                     <a:prstGeom prst="rect">
                       <a:avLst/>
@@ -1188,7 +1188,7 @@
       <w:r>
         <w:drawing>
           <wp:inline distT="0" distB="0" distL="0" distR="0">
-            <wp:extent cx="5524500" cy="3105150"/>
+            <wp:extent cx="5429250" cy="3390900"/>
             <wp:effectExtent t="0" r="0" b="0" l="0"/>
             <wp:docPr id="1" name="" descr="" title=""/>
             <wp:cNvGraphicFramePr>
@@ -1213,7 +1213,7 @@
                   <pic:spPr bwMode="auto">
                     <a:xfrm>
                       <a:off x="0" y="0"/>
-                      <a:ext cx="5524500" cy="3105150"/>
+                      <a:ext cx="5429250" cy="3390900"/>
                     </a:xfrm>
                     <a:prstGeom prst="rect">
                       <a:avLst/>
@@ -1318,7 +1318,7 @@
       <w:r>
         <w:drawing>
           <wp:inline distT="0" distB="0" distL="0" distR="0">
-            <wp:extent cx="5524500" cy="3105150"/>
+            <wp:extent cx="5429250" cy="3390900"/>
             <wp:effectExtent t="0" r="0" b="0" l="0"/>
             <wp:docPr id="1" name="" descr="" title=""/>
             <wp:cNvGraphicFramePr>
@@ -1343,7 +1343,7 @@
                   <pic:spPr bwMode="auto">
                     <a:xfrm>
                       <a:off x="0" y="0"/>
-                      <a:ext cx="5524500" cy="3105150"/>
+                      <a:ext cx="5429250" cy="3390900"/>
                     </a:xfrm>
                     <a:prstGeom prst="rect">
                       <a:avLst/>
@@ -1448,7 +1448,7 @@
       <w:r>
         <w:drawing>
           <wp:inline distT="0" distB="0" distL="0" distR="0">
-            <wp:extent cx="5524500" cy="3105150"/>
+            <wp:extent cx="5429250" cy="3390900"/>
             <wp:effectExtent t="0" r="0" b="0" l="0"/>
             <wp:docPr id="1" name="" descr="" title=""/>
             <wp:cNvGraphicFramePr>
@@ -1473,7 +1473,7 @@
                   <pic:spPr bwMode="auto">
                     <a:xfrm>
                       <a:off x="0" y="0"/>
-                      <a:ext cx="5524500" cy="3105150"/>
+                      <a:ext cx="5429250" cy="3390900"/>
                     </a:xfrm>
                     <a:prstGeom prst="rect">
                       <a:avLst/>
@@ -1578,7 +1578,7 @@
       <w:r>
         <w:drawing>
           <wp:inline distT="0" distB="0" distL="0" distR="0">
-            <wp:extent cx="5524500" cy="3105150"/>
+            <wp:extent cx="5429250" cy="3390900"/>
             <wp:effectExtent t="0" r="0" b="0" l="0"/>
             <wp:docPr id="1" name="" descr="" title=""/>
             <wp:cNvGraphicFramePr>
@@ -1603,7 +1603,7 @@
                   <pic:spPr bwMode="auto">
                     <a:xfrm>
                       <a:off x="0" y="0"/>
-                      <a:ext cx="5524500" cy="3105150"/>
+                      <a:ext cx="5429250" cy="3390900"/>
                     </a:xfrm>
                     <a:prstGeom prst="rect">
                       <a:avLst/>
@@ -1856,7 +1856,7 @@
       <w:r>
         <w:drawing>
           <wp:inline distT="0" distB="0" distL="0" distR="0">
-            <wp:extent cx="5524500" cy="3105150"/>
+            <wp:extent cx="5048250" cy="4572000"/>
             <wp:effectExtent t="0" r="0" b="0" l="0"/>
             <wp:docPr id="1" name="" descr="" title=""/>
             <wp:cNvGraphicFramePr>
@@ -1881,7 +1881,7 @@
                   <pic:spPr bwMode="auto">
                     <a:xfrm>
                       <a:off x="0" y="0"/>
-                      <a:ext cx="5524500" cy="3105150"/>
+                      <a:ext cx="5048250" cy="4572000"/>
                     </a:xfrm>
                     <a:prstGeom prst="rect">
                       <a:avLst/>
@@ -2065,7 +2065,7 @@
       <w:r>
         <w:drawing>
           <wp:inline distT="0" distB="0" distL="0" distR="0">
-            <wp:extent cx="5524500" cy="3105150"/>
+            <wp:extent cx="5057775" cy="4572000"/>
             <wp:effectExtent t="0" r="0" b="0" l="0"/>
             <wp:docPr id="1" name="" descr="" title=""/>
             <wp:cNvGraphicFramePr>
@@ -2090,7 +2090,7 @@
                   <pic:spPr bwMode="auto">
                     <a:xfrm>
                       <a:off x="0" y="0"/>
-                      <a:ext cx="5524500" cy="3105150"/>
+                      <a:ext cx="5057775" cy="4572000"/>
                     </a:xfrm>
                     <a:prstGeom prst="rect">
                       <a:avLst/>

</xml_diff>